<commit_message>
feat: actualiza portada del informe EP1 con datos oficiales del grupo
- Docente: Cristian Eduardo Medina Cespedes
- Carrera: Seguridad y Calidad en el Desarrollo de Software
- Seccion: 003V
- Universidad: DUOC UC
</commit_message>
<xml_diff>
--- a/04-Entrega/EP1_ISY1102_Plan_Pruebas_Atlas.docx
+++ b/04-Entrega/EP1_ISY1102_Plan_Pruebas_Atlas.docx
@@ -34,7 +34,7 @@
           <w:sz w:val="24"/>
           <w:szCs w:val="24"/>
         </w:rPr>
-        <w:t xml:space="preserve">UNIVERSIDAD [NOMBRE]</w:t>
+        <w:t xml:space="preserve">DUOC UC</w:t>
       </w:r>
     </w:p>
     <w:p>
@@ -179,33 +179,33 @@
           <w:sz w:val="22"/>
           <w:szCs w:val="22"/>
         </w:rPr>
-        <w:t xml:space="preserve">Carrera: [Ingenieria en Informatica / Analista Programador]</w:t>
-      </w:r>
-    </w:p>
-    <w:p>
-      <w:pPr>
-        <w:spacing w:line="360"/>
-        <w:jc w:val="both"/>
-      </w:pPr>
-      <w:r>
-        <w:rPr>
-          <w:sz w:val="22"/>
-          <w:szCs w:val="22"/>
-        </w:rPr>
-        <w:t xml:space="preserve">Seccion: [Seccion]</w:t>
-      </w:r>
-    </w:p>
-    <w:p>
-      <w:pPr>
-        <w:spacing w:line="360"/>
-        <w:jc w:val="both"/>
-      </w:pPr>
-      <w:r>
-        <w:rPr>
-          <w:sz w:val="22"/>
-          <w:szCs w:val="22"/>
-        </w:rPr>
-        <w:t xml:space="preserve">Docente: [Nombre del Docente]</w:t>
+        <w:t xml:space="preserve">Carrera: Seguridad y Calidad en el Desarrollo de Software</w:t>
+      </w:r>
+    </w:p>
+    <w:p>
+      <w:pPr>
+        <w:spacing w:line="360"/>
+        <w:jc w:val="both"/>
+      </w:pPr>
+      <w:r>
+        <w:rPr>
+          <w:sz w:val="22"/>
+          <w:szCs w:val="22"/>
+        </w:rPr>
+        <w:t xml:space="preserve">Seccion: 003V</w:t>
+      </w:r>
+    </w:p>
+    <w:p>
+      <w:pPr>
+        <w:spacing w:line="360"/>
+        <w:jc w:val="both"/>
+      </w:pPr>
+      <w:r>
+        <w:rPr>
+          <w:sz w:val="22"/>
+          <w:szCs w:val="22"/>
+        </w:rPr>
+        <w:t xml:space="preserve">Docente: Cristian Eduardo Medina Cespedes</w:t>
       </w:r>
     </w:p>
     <w:p>

</xml_diff>